<commit_message>
update to minio and added recordings
</commit_message>
<xml_diff>
--- a/webruntime/RFC_Unified_Web_Runtime v6.docx
+++ b/webruntime/RFC_Unified_Web_Runtime v6.docx
@@ -726,6 +726,671 @@
           <w:sz w:val="22"/>
         </w:rPr>
         <w:t xml:space="preserve">The platform must be designed for both channels from the start. Channel-specific integrations (auth, profile, entitlements, personalisation) stay behind clear contracts, and OCS and Resolver keep their personalisation role. OCS team alignment on the personalisation contract is required before Phase 3; this RFC is a proposal to the OCS team, not a mandate.</w:t>
+      </w:r>
+    </w:p>
+    <w:p>
+      <w:r>
+        <w:br w:type="page"/>
+      </w:r>
+    </w:p>
+    <w:p>
+      <w:pPr>
+        <w:pStyle w:val="Heading1"/>
+      </w:pPr>
+      <w:r>
+        <w:rPr>
+          <w:color w:val="1F4E79"/>
+          <w:sz w:val="32"/>
+        </w:rPr>
+        <w:t xml:space="preserve">Why the Target State</w:t>
+      </w:r>
+    </w:p>
+    <w:p>
+      <w:r>
+        <w:rPr>
+          <w:i w:val="0"/>
+          <w:sz w:val="22"/>
+        </w:rPr>
+        <w:t xml:space="preserve">Converging the two runtimes is not enough on its own. The way config is released today is also the source of most of the friction, and a single runtime on top of today's release model would keep it. The target state fixes how a change travels from authoring to users, not only where it is served from.</w:t>
+      </w:r>
+    </w:p>
+    <w:p>
+      <w:pPr>
+        <w:pStyle w:val="Heading2"/>
+      </w:pPr>
+      <w:r>
+        <w:rPr>
+          <w:color w:val="2E75B6"/>
+          <w:sz w:val="26"/>
+        </w:rPr>
+        <w:t xml:space="preserve">What Hurts Today</w:t>
+      </w:r>
+    </w:p>
+    <w:tbl>
+      <w:tblPr>
+        <w:tblStyle w:val="TableGrid"/>
+        <w:tblW w:type="auto" w:w="0"/>
+        <w:tblLook w:firstColumn="1" w:firstRow="1" w:lastColumn="0" w:lastRow="0" w:noHBand="0" w:noVBand="1" w:val="04A0"/>
+      </w:tblPr>
+      <w:tblGrid>
+        <w:gridCol w:w="3100"/>
+        <w:gridCol w:w="2900"/>
+        <w:gridCol w:w="3360"/>
+      </w:tblGrid>
+      <w:tr>
+        <w:trPr>
+          <w:tblHeader/>
+        </w:trPr>
+        <w:tc>
+          <w:tcPr>
+            <w:tcW w:type="dxa" w:w="3100"/>
+            <w:shd w:val="clear" w:color="auto" w:fill="1F4E79"/>
+          </w:tcPr>
+          <w:p>
+            <w:r>
+              <w:rPr>
+                <w:b/>
+                <w:color w:val="FFFFFF"/>
+                <w:sz w:val="20"/>
+              </w:rPr>
+              <w:t xml:space="preserve">Friction today</w:t>
+            </w:r>
+          </w:p>
+        </w:tc>
+        <w:tc>
+          <w:tcPr>
+            <w:tcW w:type="dxa" w:w="2900"/>
+            <w:shd w:val="clear" w:color="auto" w:fill="1F4E79"/>
+          </w:tcPr>
+          <w:p>
+            <w:r>
+              <w:rPr>
+                <w:b/>
+                <w:color w:val="FFFFFF"/>
+                <w:sz w:val="20"/>
+              </w:rPr>
+              <w:t xml:space="preserve">Effect</w:t>
+            </w:r>
+          </w:p>
+        </w:tc>
+        <w:tc>
+          <w:tcPr>
+            <w:tcW w:type="dxa" w:w="3360"/>
+            <w:shd w:val="clear" w:color="auto" w:fill="1F4E79"/>
+          </w:tcPr>
+          <w:p>
+            <w:r>
+              <w:rPr>
+                <w:b/>
+                <w:color w:val="FFFFFF"/>
+                <w:sz w:val="20"/>
+              </w:rPr>
+              <w:t xml:space="preserve">Target state answer</w:t>
+            </w:r>
+          </w:p>
+        </w:tc>
+      </w:tr>
+      <w:tr>
+        <w:trPr>
+          <w:cantSplit/>
+        </w:trPr>
+        <w:tc>
+          <w:tcPr>
+            <w:tcW w:type="dxa" w:w="3100"/>
+            <w:shd w:val="clear" w:color="auto" w:fill="EBF3FB"/>
+          </w:tcPr>
+          <w:p>
+            <w:r>
+              <w:rPr>
+                <w:b/>
+                <w:sz w:val="20"/>
+              </w:rPr>
+              <w:t xml:space="preserve">Every experience and platform capability is built for CBx and again for JPMM</w:t>
+            </w:r>
+          </w:p>
+        </w:tc>
+        <w:tc>
+          <w:tcPr>
+            <w:tcW w:type="dxa" w:w="2900"/>
+          </w:tcPr>
+          <w:p>
+            <w:r>
+              <w:rPr>
+                <w:b w:val="0"/>
+                <w:sz w:val="20"/>
+              </w:rPr>
+              <w:t xml:space="preserve">Double cost, double incidents, features drift apart</w:t>
+            </w:r>
+          </w:p>
+        </w:tc>
+        <w:tc>
+          <w:tcPr>
+            <w:tcW w:type="dxa" w:w="3360"/>
+          </w:tcPr>
+          <w:p>
+            <w:r>
+              <w:rPr>
+                <w:b w:val="0"/>
+                <w:sz w:val="20"/>
+              </w:rPr>
+              <w:t xml:space="preserve">One runtime, one module contract, one release path for both channels</w:t>
+            </w:r>
+          </w:p>
+        </w:tc>
+      </w:tr>
+      <w:tr>
+        <w:trPr>
+          <w:cantSplit/>
+        </w:trPr>
+        <w:tc>
+          <w:tcPr>
+            <w:tcW w:type="dxa" w:w="3100"/>
+            <w:shd w:val="clear" w:color="auto" w:fill="EBF3FB"/>
+          </w:tcPr>
+          <w:p>
+            <w:r>
+              <w:rPr>
+                <w:b/>
+                <w:sz w:val="20"/>
+              </w:rPr>
+              <w:t xml:space="preserve">JPMM config is copied into OCS separately in each environment</w:t>
+            </w:r>
+          </w:p>
+        </w:tc>
+        <w:tc>
+          <w:tcPr>
+            <w:tcW w:type="dxa" w:w="2900"/>
+          </w:tcPr>
+          <w:p>
+            <w:r>
+              <w:rPr>
+                <w:b w:val="0"/>
+                <w:sz w:val="20"/>
+              </w:rPr>
+              <w:t xml:space="preserve">What runs in prod cannot be proven to be what was tested in uat</w:t>
+            </w:r>
+          </w:p>
+        </w:tc>
+        <w:tc>
+          <w:tcPr>
+            <w:tcW w:type="dxa" w:w="3360"/>
+          </w:tcPr>
+          <w:p>
+            <w:r>
+              <w:rPr>
+                <w:b w:val="0"/>
+                <w:sz w:val="20"/>
+              </w:rPr>
+              <w:t xml:space="preserve">One immutable manifest, built once and promoted unchanged; same bytes in every environment</w:t>
+            </w:r>
+          </w:p>
+        </w:tc>
+      </w:tr>
+      <w:tr>
+        <w:trPr>
+          <w:cantSplit/>
+        </w:trPr>
+        <w:tc>
+          <w:tcPr>
+            <w:tcW w:type="dxa" w:w="3100"/>
+            <w:shd w:val="clear" w:color="auto" w:fill="EBF3FB"/>
+          </w:tcPr>
+          <w:p>
+            <w:r>
+              <w:rPr>
+                <w:b/>
+                <w:sz w:val="20"/>
+              </w:rPr>
+              <w:t xml:space="preserve">Rollback means promoting older config into each environment again</w:t>
+            </w:r>
+          </w:p>
+        </w:tc>
+        <w:tc>
+          <w:tcPr>
+            <w:tcW w:type="dxa" w:w="2900"/>
+          </w:tcPr>
+          <w:p>
+            <w:r>
+              <w:rPr>
+                <w:b w:val="0"/>
+                <w:sz w:val="20"/>
+              </w:rPr>
+              <w:t xml:space="preserve">Slow, manual and error-prone during an incident</w:t>
+            </w:r>
+          </w:p>
+        </w:tc>
+        <w:tc>
+          <w:tcPr>
+            <w:tcW w:type="dxa" w:w="3360"/>
+          </w:tcPr>
+          <w:p>
+            <w:r>
+              <w:rPr>
+                <w:b w:val="0"/>
+                <w:sz w:val="20"/>
+              </w:rPr>
+              <w:t xml:space="preserve">Rollback is pointing stable at an earlier version: seconds, nothing rebuilt</w:t>
+            </w:r>
+          </w:p>
+        </w:tc>
+      </w:tr>
+      <w:tr>
+        <w:trPr>
+          <w:cantSplit/>
+        </w:trPr>
+        <w:tc>
+          <w:tcPr>
+            <w:tcW w:type="dxa" w:w="3100"/>
+            <w:shd w:val="clear" w:color="auto" w:fill="EBF3FB"/>
+          </w:tcPr>
+          <w:p>
+            <w:r>
+              <w:rPr>
+                <w:b/>
+                <w:sz w:val="20"/>
+              </w:rPr>
+              <w:t xml:space="preserve">CBx resolves config on every request through the Resolver and OPA</w:t>
+            </w:r>
+          </w:p>
+        </w:tc>
+        <w:tc>
+          <w:tcPr>
+            <w:tcW w:type="dxa" w:w="2900"/>
+          </w:tcPr>
+          <w:p>
+            <w:r>
+              <w:rPr>
+                <w:b w:val="0"/>
+                <w:sz w:val="20"/>
+              </w:rPr>
+              <w:t xml:space="preserve">Latency on every page; config service outage is a user outage</w:t>
+            </w:r>
+          </w:p>
+        </w:tc>
+        <w:tc>
+          <w:tcPr>
+            <w:tcW w:type="dxa" w:w="3360"/>
+          </w:tcPr>
+          <w:p>
+            <w:r>
+              <w:rPr>
+                <w:b w:val="0"/>
+                <w:sz w:val="20"/>
+              </w:rPr>
+              <w:t xml:space="preserve">Config resolved once at build time; pages served from memory; control plane off the request path</w:t>
+            </w:r>
+          </w:p>
+        </w:tc>
+      </w:tr>
+      <w:tr>
+        <w:trPr>
+          <w:cantSplit/>
+        </w:trPr>
+        <w:tc>
+          <w:tcPr>
+            <w:tcW w:type="dxa" w:w="3100"/>
+            <w:shd w:val="clear" w:color="auto" w:fill="EBF3FB"/>
+          </w:tcPr>
+          <w:p>
+            <w:r>
+              <w:rPr>
+                <w:b/>
+                <w:sz w:val="20"/>
+              </w:rPr>
+              <w:t xml:space="preserve">The Registry auto-patches module versions on deploy</w:t>
+            </w:r>
+          </w:p>
+        </w:tc>
+        <w:tc>
+          <w:tcPr>
+            <w:tcW w:type="dxa" w:w="2900"/>
+          </w:tcPr>
+          <w:p>
+            <w:r>
+              <w:rPr>
+                <w:b w:val="0"/>
+                <w:sz w:val="20"/>
+              </w:rPr>
+              <w:t xml:space="preserve">A module change can reach users without passing any environment gate</w:t>
+            </w:r>
+          </w:p>
+        </w:tc>
+        <w:tc>
+          <w:tcPr>
+            <w:tcW w:type="dxa" w:w="3360"/>
+          </w:tcPr>
+          <w:p>
+            <w:r>
+              <w:rPr>
+                <w:b w:val="0"/>
+                <w:sz w:val="20"/>
+              </w:rPr>
+              <w:t xml:space="preserve">Every change is a new manifest version that goes through the gates; owners adopt versions</w:t>
+            </w:r>
+          </w:p>
+        </w:tc>
+      </w:tr>
+      <w:tr>
+        <w:trPr>
+          <w:cantSplit/>
+        </w:trPr>
+        <w:tc>
+          <w:tcPr>
+            <w:tcW w:type="dxa" w:w="3100"/>
+            <w:shd w:val="clear" w:color="auto" w:fill="EBF3FB"/>
+          </w:tcPr>
+          <w:p>
+            <w:r>
+              <w:rPr>
+                <w:b/>
+                <w:sz w:val="20"/>
+              </w:rPr>
+              <w:t xml:space="preserve">No per-tenant canary or preview of the next release</w:t>
+            </w:r>
+          </w:p>
+        </w:tc>
+        <w:tc>
+          <w:tcPr>
+            <w:tcW w:type="dxa" w:w="2900"/>
+          </w:tcPr>
+          <w:p>
+            <w:r>
+              <w:rPr>
+                <w:b w:val="0"/>
+                <w:sz w:val="20"/>
+              </w:rPr>
+              <w:t xml:space="preserve">Every release is all-or-nothing</w:t>
+            </w:r>
+          </w:p>
+        </w:tc>
+        <w:tc>
+          <w:tcPr>
+            <w:tcW w:type="dxa" w:w="3360"/>
+          </w:tcPr>
+          <w:p>
+            <w:r>
+              <w:rPr>
+                <w:b w:val="0"/>
+                <w:sz w:val="20"/>
+              </w:rPr>
+              <w:t xml:space="preserve">Preview, sticky canary and blue-green per tenant per environment</w:t>
+            </w:r>
+          </w:p>
+        </w:tc>
+      </w:tr>
+      <w:tr>
+        <w:trPr>
+          <w:cantSplit/>
+        </w:trPr>
+        <w:tc>
+          <w:tcPr>
+            <w:tcW w:type="dxa" w:w="3100"/>
+            <w:shd w:val="clear" w:color="auto" w:fill="EBF3FB"/>
+          </w:tcPr>
+          <w:p>
+            <w:r>
+              <w:rPr>
+                <w:b/>
+                <w:sz w:val="20"/>
+              </w:rPr>
+              <w:t xml:space="preserve">Header, navigation and footer are fixed in each runtime</w:t>
+            </w:r>
+          </w:p>
+        </w:tc>
+        <w:tc>
+          <w:tcPr>
+            <w:tcW w:type="dxa" w:w="2900"/>
+          </w:tcPr>
+          <w:p>
+            <w:r>
+              <w:rPr>
+                <w:b w:val="0"/>
+                <w:sz w:val="20"/>
+              </w:rPr>
+              <w:t xml:space="preserve">Brand or layout changes need a runtime release</w:t>
+            </w:r>
+          </w:p>
+        </w:tc>
+        <w:tc>
+          <w:tcPr>
+            <w:tcW w:type="dxa" w:w="3360"/>
+          </w:tcPr>
+          <w:p>
+            <w:r>
+              <w:rPr>
+                <w:b w:val="0"/>
+                <w:sz w:val="20"/>
+              </w:rPr>
+              <w:t xml:space="preserve">Experience frame as versioned modules with per-tenant settings</w:t>
+            </w:r>
+          </w:p>
+        </w:tc>
+      </w:tr>
+      <w:tr>
+        <w:trPr>
+          <w:cantSplit/>
+        </w:trPr>
+        <w:tc>
+          <w:tcPr>
+            <w:tcW w:type="dxa" w:w="3100"/>
+            <w:shd w:val="clear" w:color="auto" w:fill="EBF3FB"/>
+          </w:tcPr>
+          <w:p>
+            <w:r>
+              <w:rPr>
+                <w:b/>
+                <w:sz w:val="20"/>
+              </w:rPr>
+              <w:t xml:space="preserve">Module versions, config and release state live in different places per channel</w:t>
+            </w:r>
+          </w:p>
+        </w:tc>
+        <w:tc>
+          <w:tcPr>
+            <w:tcW w:type="dxa" w:w="2900"/>
+          </w:tcPr>
+          <w:p>
+            <w:r>
+              <w:rPr>
+                <w:b w:val="0"/>
+                <w:sz w:val="20"/>
+              </w:rPr>
+              <w:t xml:space="preserve">Hard to answer "what is live, where, and why"</w:t>
+            </w:r>
+          </w:p>
+        </w:tc>
+        <w:tc>
+          <w:tcPr>
+            <w:tcW w:type="dxa" w:w="3360"/>
+          </w:tcPr>
+          <w:p>
+            <w:r>
+              <w:rPr>
+                <w:b w:val="0"/>
+                <w:sz w:val="20"/>
+              </w:rPr>
+              <w:t xml:space="preserve">DE Console for config and catalog; WCR release records for where each version is live</w:t>
+            </w:r>
+          </w:p>
+        </w:tc>
+      </w:tr>
+    </w:tbl>
+    <w:p/>
+    <w:p>
+      <w:pPr>
+        <w:pStyle w:val="Heading2"/>
+      </w:pPr>
+      <w:r>
+        <w:rPr>
+          <w:color w:val="2E75B6"/>
+          <w:sz w:val="26"/>
+        </w:rPr>
+        <w:t xml:space="preserve">Why Not Improve the Current Stacks Instead</w:t>
+      </w:r>
+    </w:p>
+    <w:p>
+      <w:pPr>
+        <w:pStyle w:val="ListBullet"/>
+      </w:pPr>
+      <w:r>
+        <w:rPr>
+          <w:b/>
+          <w:sz w:val="22"/>
+        </w:rPr>
+        <w:t xml:space="preserve">Extending OCS to serve CBx</w:t>
+      </w:r>
+      <w:r>
+        <w:rPr>
+          <w:sz w:val="22"/>
+        </w:rPr>
+        <w:t xml:space="preserve"> keeps per-environment config copies and environment-by-environment re-promotion, and is effectively a rewrite inside a live production system.</w:t>
+      </w:r>
+    </w:p>
+    <w:p>
+      <w:pPr>
+        <w:pStyle w:val="ListBullet"/>
+      </w:pPr>
+      <w:r>
+        <w:rPr>
+          <w:b/>
+          <w:sz w:val="22"/>
+        </w:rPr>
+        <w:t xml:space="preserve">Extending the Resolver to JPMM</w:t>
+      </w:r>
+      <w:r>
+        <w:rPr>
+          <w:sz w:val="22"/>
+        </w:rPr>
+        <w:t xml:space="preserve"> keeps per-request config resolution on the hot path for both channels.</w:t>
+      </w:r>
+    </w:p>
+    <w:p>
+      <w:pPr>
+        <w:pStyle w:val="ListBullet"/>
+      </w:pPr>
+      <w:r>
+        <w:rPr>
+          <w:b/>
+          <w:sz w:val="22"/>
+        </w:rPr>
+        <w:t xml:space="preserve">Keeping both stacks and sharing libraries</w:t>
+      </w:r>
+      <w:r>
+        <w:rPr>
+          <w:sz w:val="22"/>
+        </w:rPr>
+        <w:t xml:space="preserve"> reduces some duplicate code but keeps two release models, two runtimes and two sets of incidents.</w:t>
+      </w:r>
+    </w:p>
+    <w:p>
+      <w:r>
+        <w:rPr>
+          <w:i w:val="0"/>
+          <w:sz w:val="22"/>
+        </w:rPr>
+        <w:t xml:space="preserve">Each option fixes one symptom and keeps the release model that causes the rest. The target state changes the release model once, for both channels, and reuses what already works: the DE Console, CDAaS, OCS and Resolver for personalisation, and OPA.</w:t>
+      </w:r>
+    </w:p>
+    <w:p>
+      <w:pPr>
+        <w:pStyle w:val="Heading2"/>
+      </w:pPr>
+      <w:r>
+        <w:rPr>
+          <w:color w:val="2E75B6"/>
+          <w:sz w:val="26"/>
+        </w:rPr>
+        <w:t xml:space="preserve">What the Target State Delivers</w:t>
+      </w:r>
+    </w:p>
+    <w:p>
+      <w:pPr>
+        <w:pStyle w:val="ListBullet"/>
+      </w:pPr>
+      <w:r>
+        <w:rPr>
+          <w:b/>
+          <w:sz w:val="22"/>
+        </w:rPr>
+        <w:t xml:space="preserve">Safety:</w:t>
+      </w:r>
+      <w:r>
+        <w:rPr>
+          <w:sz w:val="22"/>
+        </w:rPr>
+        <w:t xml:space="preserve"> every change is versioned, validated, tested in each environment and reversible in seconds.</w:t>
+      </w:r>
+    </w:p>
+    <w:p>
+      <w:pPr>
+        <w:pStyle w:val="ListBullet"/>
+      </w:pPr>
+      <w:r>
+        <w:rPr>
+          <w:b/>
+          <w:sz w:val="22"/>
+        </w:rPr>
+        <w:t xml:space="preserve">Speed:</w:t>
+      </w:r>
+      <w:r>
+        <w:rPr>
+          <w:sz w:val="22"/>
+        </w:rPr>
+        <w:t xml:space="preserve"> a config change is live in dev within seconds; promotion and rollback are pointer moves.</w:t>
+      </w:r>
+    </w:p>
+    <w:p>
+      <w:pPr>
+        <w:pStyle w:val="ListBullet"/>
+      </w:pPr>
+      <w:r>
+        <w:rPr>
+          <w:b/>
+          <w:sz w:val="22"/>
+        </w:rPr>
+        <w:t xml:space="preserve">Resilience:</w:t>
+      </w:r>
+      <w:r>
+        <w:rPr>
+          <w:sz w:val="22"/>
+        </w:rPr>
+        <w:t xml:space="preserve"> users are served from memory; authoring and release systems can fail without user impact.</w:t>
+      </w:r>
+    </w:p>
+    <w:p>
+      <w:pPr>
+        <w:pStyle w:val="ListBullet"/>
+      </w:pPr>
+      <w:r>
+        <w:rPr>
+          <w:b/>
+          <w:sz w:val="22"/>
+        </w:rPr>
+        <w:t xml:space="preserve">Cost:</w:t>
+      </w:r>
+      <w:r>
+        <w:rPr>
+          <w:sz w:val="22"/>
+        </w:rPr>
+        <w:t xml:space="preserve"> one platform to build, run and improve; channel teams build once.</w:t>
+      </w:r>
+    </w:p>
+    <w:p>
+      <w:pPr>
+        <w:pStyle w:val="ListBullet"/>
+      </w:pPr>
+      <w:r>
+        <w:rPr>
+          <w:b/>
+          <w:sz w:val="22"/>
+        </w:rPr>
+        <w:t xml:space="preserve">Clarity:</w:t>
+      </w:r>
+      <w:r>
+        <w:rPr>
+          <w:sz w:val="22"/>
+        </w:rPr>
+        <w:t xml:space="preserve"> one answer to "what is live for this tenant in this environment, and since when".</w:t>
       </w:r>
     </w:p>
     <w:p>
@@ -4272,6 +4937,520 @@
           <w:sz w:val="22"/>
         </w:rPr>
         <w:t xml:space="preserve">WCR is the composition and release service. It is a control-plane service: users never call it, so an outage only pauses releases. It has four parts: an event listener, a generator, checks, and a release API.</w:t>
+      </w:r>
+    </w:p>
+    <w:p>
+      <w:pPr>
+        <w:pStyle w:val="Heading2"/>
+      </w:pPr>
+      <w:r>
+        <w:rPr>
+          <w:color w:val="2E75B6"/>
+          <w:sz w:val="26"/>
+        </w:rPr>
+        <w:t xml:space="preserve">Why a Web Composition Registry</w:t>
+      </w:r>
+    </w:p>
+    <w:p>
+      <w:r>
+        <w:rPr>
+          <w:i w:val="0"/>
+          <w:sz w:val="22"/>
+        </w:rPr>
+        <w:t xml:space="preserve">Something has to turn a tenant's config into a release artefact and own where that artefact is live. That job does not belong to the authoring tool or to the page server, so the target state gives it to a dedicated control-plane service.</w:t>
+      </w:r>
+    </w:p>
+    <w:tbl>
+      <w:tblPr>
+        <w:tblStyle w:val="TableGrid"/>
+        <w:tblW w:type="auto" w:w="0"/>
+        <w:tblLook w:firstColumn="1" w:firstRow="1" w:lastColumn="0" w:lastRow="0" w:noHBand="0" w:noVBand="1" w:val="04A0"/>
+      </w:tblPr>
+      <w:tblGrid>
+        <w:gridCol w:w="3100"/>
+        <w:gridCol w:w="6260"/>
+      </w:tblGrid>
+      <w:tr>
+        <w:trPr>
+          <w:tblHeader/>
+        </w:trPr>
+        <w:tc>
+          <w:tcPr>
+            <w:tcW w:type="dxa" w:w="3100"/>
+            <w:shd w:val="clear" w:color="auto" w:fill="1F4E79"/>
+          </w:tcPr>
+          <w:p>
+            <w:r>
+              <w:rPr>
+                <w:b/>
+                <w:color w:val="FFFFFF"/>
+                <w:sz w:val="20"/>
+              </w:rPr>
+              <w:t xml:space="preserve">Need</w:t>
+            </w:r>
+          </w:p>
+        </w:tc>
+        <w:tc>
+          <w:tcPr>
+            <w:tcW w:type="dxa" w:w="6260"/>
+            <w:shd w:val="clear" w:color="auto" w:fill="1F4E79"/>
+          </w:tcPr>
+          <w:p>
+            <w:r>
+              <w:rPr>
+                <w:b/>
+                <w:color w:val="FFFFFF"/>
+                <w:sz w:val="20"/>
+              </w:rPr>
+              <w:t xml:space="preserve">Why WCR</w:t>
+            </w:r>
+          </w:p>
+        </w:tc>
+      </w:tr>
+      <w:tr>
+        <w:trPr>
+          <w:cantSplit/>
+        </w:trPr>
+        <w:tc>
+          <w:tcPr>
+            <w:tcW w:type="dxa" w:w="3100"/>
+            <w:shd w:val="clear" w:color="auto" w:fill="EBF3FB"/>
+          </w:tcPr>
+          <w:p>
+            <w:r>
+              <w:rPr>
+                <w:b/>
+                <w:sz w:val="20"/>
+              </w:rPr>
+              <w:t xml:space="preserve">Compose config, exact module versions and frame into one complete document</w:t>
+            </w:r>
+          </w:p>
+        </w:tc>
+        <w:tc>
+          <w:tcPr>
+            <w:tcW w:type="dxa" w:w="6260"/>
+          </w:tcPr>
+          <w:p>
+            <w:r>
+              <w:rPr>
+                <w:b w:val="0"/>
+                <w:sz w:val="20"/>
+              </w:rPr>
+              <w:t xml:space="preserve">Composition happens once, at build time. Without it the page server would compose on every request, which is today's Resolver model with its latency and runtime dependency.</w:t>
+            </w:r>
+          </w:p>
+        </w:tc>
+      </w:tr>
+      <w:tr>
+        <w:trPr>
+          <w:cantSplit/>
+        </w:trPr>
+        <w:tc>
+          <w:tcPr>
+            <w:tcW w:type="dxa" w:w="3100"/>
+            <w:shd w:val="clear" w:color="auto" w:fill="EBF3FB"/>
+          </w:tcPr>
+          <w:p>
+            <w:r>
+              <w:rPr>
+                <w:b/>
+                <w:sz w:val="20"/>
+              </w:rPr>
+              <w:t xml:space="preserve">Build once, promote unchanged</w:t>
+            </w:r>
+          </w:p>
+        </w:tc>
+        <w:tc>
+          <w:tcPr>
+            <w:tcW w:type="dxa" w:w="6260"/>
+          </w:tcPr>
+          <w:p>
+            <w:r>
+              <w:rPr>
+                <w:b w:val="0"/>
+                <w:sz w:val="20"/>
+              </w:rPr>
+              <w:t xml:space="preserve">Build-once needs an immutable artefact produced outside any environment. WCR builds it once and every environment points at the same file.</w:t>
+            </w:r>
+          </w:p>
+        </w:tc>
+      </w:tr>
+      <w:tr>
+        <w:trPr>
+          <w:cantSplit/>
+        </w:trPr>
+        <w:tc>
+          <w:tcPr>
+            <w:tcW w:type="dxa" w:w="3100"/>
+            <w:shd w:val="clear" w:color="auto" w:fill="EBF3FB"/>
+          </w:tcPr>
+          <w:p>
+            <w:r>
+              <w:rPr>
+                <w:b/>
+                <w:sz w:val="20"/>
+              </w:rPr>
+              <w:t xml:space="preserve">A gate before anything reaches users</w:t>
+            </w:r>
+          </w:p>
+        </w:tc>
+        <w:tc>
+          <w:tcPr>
+            <w:tcW w:type="dxa" w:w="6260"/>
+          </w:tcPr>
+          <w:p>
+            <w:r>
+              <w:rPr>
+                <w:b w:val="0"/>
+                <w:sz w:val="20"/>
+              </w:rPr>
+              <w:t xml:space="preserve">WCR validates every manifest (schema, catalog, slots, settings, URL safety) and refuses to release an invalid one.</w:t>
+            </w:r>
+          </w:p>
+        </w:tc>
+      </w:tr>
+      <w:tr>
+        <w:trPr>
+          <w:cantSplit/>
+        </w:trPr>
+        <w:tc>
+          <w:tcPr>
+            <w:tcW w:type="dxa" w:w="3100"/>
+            <w:shd w:val="clear" w:color="auto" w:fill="EBF3FB"/>
+          </w:tcPr>
+          <w:p>
+            <w:r>
+              <w:rPr>
+                <w:b/>
+                <w:sz w:val="20"/>
+              </w:rPr>
+              <w:t xml:space="preserve">An owner for release state</w:t>
+            </w:r>
+          </w:p>
+        </w:tc>
+        <w:tc>
+          <w:tcPr>
+            <w:tcW w:type="dxa" w:w="6260"/>
+          </w:tcPr>
+          <w:p>
+            <w:r>
+              <w:rPr>
+                <w:b w:val="0"/>
+                <w:sz w:val="20"/>
+              </w:rPr>
+              <w:t xml:space="preserve">Pointers, promotion gates, canary, rollback and release records need one owner and one writer. WCR is that single writer, which makes releases consistent and auditable.</w:t>
+            </w:r>
+          </w:p>
+        </w:tc>
+      </w:tr>
+      <w:tr>
+        <w:trPr>
+          <w:cantSplit/>
+        </w:trPr>
+        <w:tc>
+          <w:tcPr>
+            <w:tcW w:type="dxa" w:w="3100"/>
+            <w:shd w:val="clear" w:color="auto" w:fill="EBF3FB"/>
+          </w:tcPr>
+          <w:p>
+            <w:r>
+              <w:rPr>
+                <w:b/>
+                <w:sz w:val="20"/>
+              </w:rPr>
+              <w:t xml:space="preserve">Keep production writes narrow</w:t>
+            </w:r>
+          </w:p>
+        </w:tc>
+        <w:tc>
+          <w:tcPr>
+            <w:tcW w:type="dxa" w:w="6260"/>
+          </w:tcPr>
+          <w:p>
+            <w:r>
+              <w:rPr>
+                <w:b w:val="0"/>
+                <w:sz w:val="20"/>
+              </w:rPr>
+              <w:t xml:space="preserve">Only WCR's role can write manifests and pointers. The DE Console stays an authoring tool and never needs write access to production release state.</w:t>
+            </w:r>
+          </w:p>
+        </w:tc>
+      </w:tr>
+      <w:tr>
+        <w:trPr>
+          <w:cantSplit/>
+        </w:trPr>
+        <w:tc>
+          <w:tcPr>
+            <w:tcW w:type="dxa" w:w="3100"/>
+            <w:shd w:val="clear" w:color="auto" w:fill="EBF3FB"/>
+          </w:tcPr>
+          <w:p>
+            <w:r>
+              <w:rPr>
+                <w:b/>
+                <w:sz w:val="20"/>
+              </w:rPr>
+              <w:t xml:space="preserve">Keep the request path simple</w:t>
+            </w:r>
+          </w:p>
+        </w:tc>
+        <w:tc>
+          <w:tcPr>
+            <w:tcW w:type="dxa" w:w="6260"/>
+          </w:tcPr>
+          <w:p>
+            <w:r>
+              <w:rPr>
+                <w:b w:val="0"/>
+                <w:sz w:val="20"/>
+              </w:rPr>
+              <w:t xml:space="preserve">The page server only reads files and picks a version. All composition and release logic stays in the control plane, so it can fail without affecting users.</w:t>
+            </w:r>
+          </w:p>
+        </w:tc>
+      </w:tr>
+      <w:tr>
+        <w:trPr>
+          <w:cantSplit/>
+        </w:trPr>
+        <w:tc>
+          <w:tcPr>
+            <w:tcW w:type="dxa" w:w="3100"/>
+            <w:shd w:val="clear" w:color="auto" w:fill="EBF3FB"/>
+          </w:tcPr>
+          <w:p>
+            <w:r>
+              <w:rPr>
+                <w:b/>
+                <w:sz w:val="20"/>
+              </w:rPr>
+              <w:t xml:space="preserve">One path for both channels</w:t>
+            </w:r>
+          </w:p>
+        </w:tc>
+        <w:tc>
+          <w:tcPr>
+            <w:tcW w:type="dxa" w:w="6260"/>
+          </w:tcPr>
+          <w:p>
+            <w:r>
+              <w:rPr>
+                <w:b w:val="0"/>
+                <w:sz w:val="20"/>
+              </w:rPr>
+              <w:t xml:space="preserve">CBx and JPMM config go through the same builder and the same gates, which is what makes convergence real rather than cosmetic.</w:t>
+            </w:r>
+          </w:p>
+        </w:tc>
+      </w:tr>
+    </w:tbl>
+    <w:p/>
+    <w:p>
+      <w:pPr>
+        <w:pStyle w:val="Heading2"/>
+      </w:pPr>
+      <w:r>
+        <w:rPr>
+          <w:color w:val="2E75B6"/>
+          <w:sz w:val="26"/>
+        </w:rPr>
+        <w:t xml:space="preserve">Alternatives Considered</w:t>
+      </w:r>
+    </w:p>
+    <w:tbl>
+      <w:tblPr>
+        <w:tblStyle w:val="TableGrid"/>
+        <w:tblW w:type="auto" w:w="0"/>
+        <w:tblLook w:firstColumn="1" w:firstRow="1" w:lastColumn="0" w:lastRow="0" w:noHBand="0" w:noVBand="1" w:val="04A0"/>
+      </w:tblPr>
+      <w:tblGrid>
+        <w:gridCol w:w="3100"/>
+        <w:gridCol w:w="6260"/>
+      </w:tblGrid>
+      <w:tr>
+        <w:trPr>
+          <w:tblHeader/>
+        </w:trPr>
+        <w:tc>
+          <w:tcPr>
+            <w:tcW w:type="dxa" w:w="3100"/>
+            <w:shd w:val="clear" w:color="auto" w:fill="1F4E79"/>
+          </w:tcPr>
+          <w:p>
+            <w:r>
+              <w:rPr>
+                <w:b/>
+                <w:color w:val="FFFFFF"/>
+                <w:sz w:val="20"/>
+              </w:rPr>
+              <w:t xml:space="preserve">Alternative</w:t>
+            </w:r>
+          </w:p>
+        </w:tc>
+        <w:tc>
+          <w:tcPr>
+            <w:tcW w:type="dxa" w:w="6260"/>
+            <w:shd w:val="clear" w:color="auto" w:fill="1F4E79"/>
+          </w:tcPr>
+          <w:p>
+            <w:r>
+              <w:rPr>
+                <w:b/>
+                <w:color w:val="FFFFFF"/>
+                <w:sz w:val="20"/>
+              </w:rPr>
+              <w:t xml:space="preserve">Why not</w:t>
+            </w:r>
+          </w:p>
+        </w:tc>
+      </w:tr>
+      <w:tr>
+        <w:trPr>
+          <w:cantSplit/>
+        </w:trPr>
+        <w:tc>
+          <w:tcPr>
+            <w:tcW w:type="dxa" w:w="3100"/>
+            <w:shd w:val="clear" w:color="auto" w:fill="EBF3FB"/>
+          </w:tcPr>
+          <w:p>
+            <w:r>
+              <w:rPr>
+                <w:b/>
+                <w:sz w:val="20"/>
+              </w:rPr>
+              <w:t xml:space="preserve">The Web Runtime Service composes at request time</w:t>
+            </w:r>
+          </w:p>
+        </w:tc>
+        <w:tc>
+          <w:tcPr>
+            <w:tcW w:type="dxa" w:w="6260"/>
+          </w:tcPr>
+          <w:p>
+            <w:r>
+              <w:rPr>
+                <w:b w:val="0"/>
+                <w:sz w:val="20"/>
+              </w:rPr>
+              <w:t xml:space="preserve">Per-request composition (today's Resolver): latency, a config dependency on every page, and what users get can change without a release.</w:t>
+            </w:r>
+          </w:p>
+        </w:tc>
+      </w:tr>
+      <w:tr>
+        <w:trPr>
+          <w:cantSplit/>
+        </w:trPr>
+        <w:tc>
+          <w:tcPr>
+            <w:tcW w:type="dxa" w:w="3100"/>
+            <w:shd w:val="clear" w:color="auto" w:fill="EBF3FB"/>
+          </w:tcPr>
+          <w:p>
+            <w:r>
+              <w:rPr>
+                <w:b/>
+                <w:sz w:val="20"/>
+              </w:rPr>
+              <w:t xml:space="preserve">The DE Console builds and releases manifests itself</w:t>
+            </w:r>
+          </w:p>
+        </w:tc>
+        <w:tc>
+          <w:tcPr>
+            <w:tcW w:type="dxa" w:w="6260"/>
+          </w:tcPr>
+          <w:p>
+            <w:r>
+              <w:rPr>
+                <w:b w:val="0"/>
+                <w:sz w:val="20"/>
+              </w:rPr>
+              <w:t xml:space="preserve">Possible, but couples the authoring UI with production-critical writes, gives the DE Console write access to release state, and ties release availability to the authoring tool. WCR can still start as a separately deployed module of the DE Console codebase if that is quicker, as long as it keeps its own identity, permissions and deployment.</w:t>
+            </w:r>
+          </w:p>
+        </w:tc>
+      </w:tr>
+      <w:tr>
+        <w:trPr>
+          <w:cantSplit/>
+        </w:trPr>
+        <w:tc>
+          <w:tcPr>
+            <w:tcW w:type="dxa" w:w="3100"/>
+            <w:shd w:val="clear" w:color="auto" w:fill="EBF3FB"/>
+          </w:tcPr>
+          <w:p>
+            <w:r>
+              <w:rPr>
+                <w:b/>
+                <w:sz w:val="20"/>
+              </w:rPr>
+              <w:t xml:space="preserve">OCS keeps storing and promoting config</w:t>
+            </w:r>
+          </w:p>
+        </w:tc>
+        <w:tc>
+          <w:tcPr>
+            <w:tcW w:type="dxa" w:w="6260"/>
+          </w:tcPr>
+          <w:p>
+            <w:r>
+              <w:rPr>
+                <w:b w:val="0"/>
+                <w:sz w:val="20"/>
+              </w:rPr>
+              <w:t xml:space="preserve">Keeps per-environment copies and re-promotion, which is the main friction today.</w:t>
+            </w:r>
+          </w:p>
+        </w:tc>
+      </w:tr>
+      <w:tr>
+        <w:trPr>
+          <w:cantSplit/>
+        </w:trPr>
+        <w:tc>
+          <w:tcPr>
+            <w:tcW w:type="dxa" w:w="3100"/>
+            <w:shd w:val="clear" w:color="auto" w:fill="EBF3FB"/>
+          </w:tcPr>
+          <w:p>
+            <w:r>
+              <w:rPr>
+                <w:b/>
+                <w:sz w:val="20"/>
+              </w:rPr>
+              <w:t xml:space="preserve">A shared database instead of S3</w:t>
+            </w:r>
+          </w:p>
+        </w:tc>
+        <w:tc>
+          <w:tcPr>
+            <w:tcW w:type="dxa" w:w="6260"/>
+          </w:tcPr>
+          <w:p>
+            <w:r>
+              <w:rPr>
+                <w:b w:val="0"/>
+                <w:sz w:val="20"/>
+              </w:rPr>
+              <w:t xml:space="preserve">Adds a database to run and replicate; immutable files in S3 are simpler, cheaper and fit build-once.</w:t>
+            </w:r>
+          </w:p>
+        </w:tc>
+      </w:tr>
+    </w:tbl>
+    <w:p/>
+    <w:p>
+      <w:r>
+        <w:rPr>
+          <w:i w:val="0"/>
+          <w:sz w:val="22"/>
+        </w:rPr>
+        <w:t xml:space="preserve">The name reflects what it holds: the registry of composed manifest versions and of where each one is released.</w:t>
       </w:r>
     </w:p>
     <w:p>

</xml_diff>